<commit_message>
Add login screenshot to report
</commit_message>
<xml_diff>
--- a/docs/ргз рпп.docx
+++ b/docs/ргз рпп.docx
@@ -7187,16 +7187,72 @@
     <w:p>
       <w:pPr>
         <w:spacing w:after="200"/>
-        <w:rPr>
-          <w:lang w:val="ru-RU"/>
-        </w:rPr>
-      </w:pPr>
-      <w:r>
-        <w:rPr>
-          <w:highlight w:val="yellow"/>
-          <w:lang w:val="ru-RU"/>
-        </w:rPr>
-        <w:t>Рисунок входа</w:t>
+        <w:jc w:val="center"/>
+        <w:rPr>
+          <w:lang w:val="ru-RU"/>
+        </w:rPr>
+      </w:pPr>
+      <w:r/>
+      <w:r>
+        <w:drawing>
+          <wp:inline xmlns:a="http://schemas.openxmlformats.org/drawingml/2006/main" xmlns:pic="http://schemas.openxmlformats.org/drawingml/2006/picture">
+            <wp:extent cx="5852160" cy="3684376"/>
+            <wp:docPr id="1777569069" name="Picture 1777569069"/>
+            <wp:cNvGraphicFramePr>
+              <a:graphicFrameLocks noChangeAspect="1"/>
+            </wp:cNvGraphicFramePr>
+            <a:graphic>
+              <a:graphicData uri="http://schemas.openxmlformats.org/drawingml/2006/picture">
+                <pic:pic>
+                  <pic:nvPicPr>
+                    <pic:cNvPr id="0" name="09_login_filled.png"/>
+                    <pic:cNvPicPr/>
+                  </pic:nvPicPr>
+                  <pic:blipFill>
+                    <a:blip r:embed="rId42"/>
+                    <a:stretch>
+                      <a:fillRect/>
+                    </a:stretch>
+                  </pic:blipFill>
+                  <pic:spPr>
+                    <a:xfrm>
+                      <a:off x="0" y="0"/>
+                      <a:ext cx="5852160" cy="3684376"/>
+                    </a:xfrm>
+                    <a:prstGeom prst="rect"/>
+                  </pic:spPr>
+                </pic:pic>
+              </a:graphicData>
+            </a:graphic>
+          </wp:inline>
+        </w:drawing>
+      </w:r>
+    </w:p>
+    <w:p>
+      <w:pPr>
+        <w:jc w:val="center"/>
+      </w:pPr>
+      <w:r>
+        <w:rPr>
+          <w:rFonts w:ascii="Times New Roman" w:hAnsi="Times New Roman"/>
+          <w:i/>
+          <w:sz w:val="24"/>
+        </w:rPr>
+        <w:t>Рисунок 2 — страница авторизации пользователя</w:t>
+      </w:r>
+    </w:p>
+    <w:p>
+      <w:pPr>
+        <w:spacing w:line="360" w:lineRule="auto"/>
+        <w:ind w:firstLine="706"/>
+        <w:jc w:val="both"/>
+      </w:pPr>
+      <w:r>
+        <w:rPr>
+          <w:rFonts w:ascii="Times New Roman" w:hAnsi="Times New Roman"/>
+          <w:sz w:val="28"/>
+        </w:rPr>
+        <w:t>На рисунке 2 показана форма входа в приложение. В качестве примера указан логин student_demo и пароль Strong123. Пароль относится к сложному формату, потому что содержит латинские буквы и цифры, а само значение в поле ввода скрывается точками. После отправки формы backend ищет пользователя по нормализованному логину и проверяет введенный пароль с помощью check_password_hash, сравнивая его с хэшем, сохраненным в таблице users.</w:t>
       </w:r>
     </w:p>
     <w:p>
@@ -7428,10 +7484,11 @@
       </w:pPr>
       <w:r>
         <w:rPr>
-          <w:szCs w:val="28"/>
-          <w:lang w:val="ru-RU"/>
-        </w:rPr>
-        <w:t>Рисунок 2 — список операций после регистрации</w:t>
+          <w:rFonts w:ascii="Times New Roman" w:hAnsi="Times New Roman"/>
+          <w:i/>
+          <w:sz w:val="24"/>
+        </w:rPr>
+        <w:t>Рисунок 3 — список операций после регистрации</w:t>
       </w:r>
     </w:p>
     <w:p>
@@ -7551,10 +7608,11 @@
       </w:pPr>
       <w:r>
         <w:rPr>
-          <w:szCs w:val="28"/>
-          <w:lang w:val="ru-RU"/>
-        </w:rPr>
-        <w:t>Рисунок 3 — форма добавления операции</w:t>
+          <w:rFonts w:ascii="Times New Roman" w:hAnsi="Times New Roman"/>
+          <w:i/>
+          <w:sz w:val="24"/>
+        </w:rPr>
+        <w:t>Рисунок 4 — форма добавления операции</w:t>
       </w:r>
     </w:p>
     <w:p>
@@ -7820,10 +7878,11 @@
       </w:pPr>
       <w:r>
         <w:rPr>
-          <w:szCs w:val="28"/>
-          <w:lang w:val="ru-RU"/>
-        </w:rPr>
-        <w:t>Рисунок 4 — успешное добавление операции</w:t>
+          <w:rFonts w:ascii="Times New Roman" w:hAnsi="Times New Roman"/>
+          <w:i/>
+          <w:sz w:val="24"/>
+        </w:rPr>
+        <w:t>Рисунок 5 — успешное добавление операции</w:t>
       </w:r>
     </w:p>
     <w:p>
@@ -8171,16 +8230,11 @@
       </w:pPr>
       <w:r>
         <w:rPr>
-          <w:szCs w:val="28"/>
-          <w:lang w:val="ru-RU"/>
-        </w:rPr>
-        <w:t xml:space="preserve">Рисунок 5 — просмотр операций с конвертацией в </w:t>
-      </w:r>
-      <w:r>
-        <w:rPr>
-          <w:szCs w:val="28"/>
-        </w:rPr>
-        <w:t>USD</w:t>
+          <w:rFonts w:ascii="Times New Roman" w:hAnsi="Times New Roman"/>
+          <w:i/>
+          <w:sz w:val="24"/>
+        </w:rPr>
+        <w:t>Рисунок 6 — просмотр операций с конвертацией в USD</w:t>
       </w:r>
     </w:p>
     <w:p>
@@ -8563,10 +8617,11 @@
       </w:pPr>
       <w:r>
         <w:rPr>
-          <w:szCs w:val="28"/>
-          <w:lang w:val="ru-RU"/>
-        </w:rPr>
-        <w:t>Рисунок 6 — результат удаления операции</w:t>
+          <w:rFonts w:ascii="Times New Roman" w:hAnsi="Times New Roman"/>
+          <w:i/>
+          <w:sz w:val="24"/>
+        </w:rPr>
+        <w:t>Рисунок 7 — результат удаления операции</w:t>
       </w:r>
     </w:p>
     <w:p>
@@ -8745,10 +8800,11 @@
       </w:pPr>
       <w:r>
         <w:rPr>
-          <w:szCs w:val="28"/>
-          <w:lang w:val="ru-RU"/>
-        </w:rPr>
-        <w:t>Рисунок 7 — успешный ответ внешнего сервиса курса валют</w:t>
+          <w:rFonts w:ascii="Times New Roman" w:hAnsi="Times New Roman"/>
+          <w:i/>
+          <w:sz w:val="24"/>
+        </w:rPr>
+        <w:t>Рисунок 8 — успешный ответ внешнего сервиса курса валют</w:t>
       </w:r>
     </w:p>
     <w:p>
@@ -8912,10 +8968,11 @@
       </w:pPr>
       <w:r>
         <w:rPr>
-          <w:szCs w:val="28"/>
-          <w:lang w:val="ru-RU"/>
-        </w:rPr>
-        <w:t>Рисунок 8 — ошибка внешнего сервиса при неизвестной валюте</w:t>
+          <w:rFonts w:ascii="Times New Roman" w:hAnsi="Times New Roman"/>
+          <w:i/>
+          <w:sz w:val="24"/>
+        </w:rPr>
+        <w:t>Рисунок 9 — ошибка внешнего сервиса при неизвестной валюте</w:t>
       </w:r>
     </w:p>
     <w:p>

</xml_diff>